<commit_message>
Section 2.5.3: cover all three approach families and cut author names
Co-Authored-By: Claude Opus 5.5 <noreply@anthropic.com>
Claude-Session: https://claude.ai/code/session_014SkMbo2NZiwC1uVAmAQ9cR
</commit_message>
<xml_diff>
--- a/literature-review/Section_2.5_Revised.docx
+++ b/literature-review/Section_2.5_Revised.docx
@@ -242,7 +242,7 @@
         <w:t xml:space="preserve">Why classification is difficult.</w:t>
       </w:r>
       <w:r>
-        <w:t xml:space="preserve"> In their survey, Sahoo et al. [1] found that only limited success had been achieved, mainly with simple PD sources, while complex patterns from real insulation systems were still hard to classify. The main reasons given in the literature are:</w:t>
+        <w:t xml:space="preserve"> An early survey found that only limited success had been achieved, mainly with simple PD sources, while complex patterns from real insulation systems were still hard to classify [1]. The main reasons given in the literature are:</w:t>
       </w:r>
     </w:p>
     <w:p>
@@ -349,7 +349,7 @@
         <w:t xml:space="preserve">Features.</w:t>
       </w:r>
       <w:r>
-        <w:t xml:space="preserve"> For PRPD data, the most common features are statistical operators that describe the shape of the phase-resolved distributions, such as skewness, kurtosis, the number of peaks and the cross-correlation between the positive and negative half-cycles [5]. Fractal features [1] and principal component analysis (PCA) [6] have also been used. For time-resolved data, the features describe each pulse, for example its amplitude, its rise and decay times, and statistical or frequency-domain values [3]. Because so many features can be extracted, some studies keep only the most useful ones. For example, Peng et al. [4] used a random forest (RF) to select the best features from more than 1,200 pulse and PRPD features.</w:t>
+        <w:t xml:space="preserve"> For PRPD data, the most common features are statistical operators that describe the shape of the phase-resolved distributions, such as skewness, kurtosis, the number of peaks and the cross-correlation between the positive and negative half-cycles [5]. Fractal features [1] and principal component analysis (PCA) [6] have also been used. For time-resolved data, the features describe each pulse, for example its amplitude, its rise and decay times, and statistical or frequency-domain values [3]. Because so many features can be extracted, some studies keep only the most useful ones. For example, a random forest (RF) has been used to select the best features from more than 1,200 pulse and PRPD features [4].</w:t>
       </w:r>
     </w:p>
     <w:p>
@@ -364,7 +364,7 @@
         <w:t xml:space="preserve">Classifiers.</w:t>
       </w:r>
       <w:r>
-        <w:t xml:space="preserve"> ANNs, mostly back-propagation neural networks (BPNNs), were among the first classifiers used. Gulski and Krivda [5] used statistical descriptors as inputs to three types of neural network (back-propagation, Kohonen self-organising map and learning vector quantisation), and all three recognised the trained defects fairly well. ANNs are fast once trained, but they need a lot of representative training data and can overtrain [3]. SVMs separate two classes using the boundary with the largest margin between them, and kernel functions allow this boundary to be non-linear [3]. They do not need a network structure to be designed and have performed well in many PD studies [3]. Other classifiers that have been used include nearest-neighbour, fuzzy logic, adaptive neuro-fuzzy inference systems (ANFIS), decision trees and RF [1], [2], [3].</w:t>
+        <w:t xml:space="preserve"> ANNs, mostly back-propagation neural networks (BPNNs), were among the first classifiers used. In early work, statistical descriptors were used as inputs to three types of neural network (back-propagation, Kohonen self-organising map and learning vector quantisation), and all three recognised the trained defects fairly well [5]. ANNs are fast once trained, but they need a lot of representative training data and can overtrain [3]. SVMs separate two classes using the boundary with the largest margin between them, and kernel functions allow this boundary to be non-linear [3]. They do not need a network structure to be designed and have performed well in many PD studies [3]. Other classifiers that have been used include nearest-neighbour, fuzzy logic, adaptive neuro-fuzzy inference systems (ANFIS), decision trees and RF [1], [2], [3].</w:t>
       </w:r>
     </w:p>
     <w:p>
@@ -387,7 +387,7 @@
         </w:r>
       </w:fldSimple>
       <w:r>
-        <w:t xml:space="preserve">). Raymond et al. [6] reached 98.8% with an SVM on statistical PRPD features from defects in XLPE cable joints. Qin et al. [7] reached 97.29% on composite defects in XLPE cable, but only after optimising the SVM parameters, since a standard SVM with the same features gave 84.52%. The main advantages of these methods are that the features can be linked to the physics of the discharge, that less data is needed and that training is fast. Their main weakness is that the results depend heavily on the choice of features and parameters, which often needs expert knowledge [3]. Features that work well on clean data may also fail when noise is present (Section 2.5.5). In this project, an SVM and an RF on hand-crafted features will be used as baselines for the DL models.</w:t>
+        <w:t xml:space="preserve">). An SVM on statistical PRPD features reached 98.8% for defects in XLPE cable joints [6]. For composite defects in XLPE cable, a tuned SVM reached 97.29%, while a standard SVM with the same features gave only 84.52% [7], which shows how much parameter tuning matters. The main advantages of these methods are that the features can be linked to the physics of the discharge, that less data is needed and that training is fast. Their main weakness is that the results depend heavily on the choice of features and parameters, which often needs expert knowledge [3]. Features that work well on clean data may also fail when noise is present (Section 2.5.5). In this project, an SVM and an RF on hand-crafted features will be used as baselines for the DL models.</w:t>
       </w:r>
     </w:p>
     <w:p>
@@ -403,7 +403,7 @@
         <w:keepNext w:val="false"/>
       </w:pPr>
       <w:r>
-        <w:t xml:space="preserve">DL uses networks with many layers that learn the features directly from the input, so a separate feature-extraction step is not needed [3]. The most common types for PD are convolutional neural networks (CNNs), which learn local patterns using small filters, and recurrent networks such as long short-term memory (LSTM) networks, which are designed for sequences [3]. In this review the studies are grouped by their input rather than by network type, because the same network can be used on different inputs. This gives the three approach families shown in </w:t>
+        <w:t xml:space="preserve">DL uses networks with many layers that learn the features directly from the input, so a separate feature-extraction step is not needed [3]. The most common types for PD are convolutional neural networks (CNNs), which learn local patterns using small filters, and recurrent networks such as long short-term memory (LSTM) networks, which are designed for sequences [3]. Because the same network can be used on different inputs, the studies are grouped below by their input, using the three approach families shown in </w:t>
       </w:r>
       <w:fldSimple w:instr="REF _Ref900101 \h">
         <w:r>
@@ -495,7 +495,7 @@
         <w:t xml:space="preserve">Temporal (1D) signals.</w:t>
       </w:r>
       <w:r>
-        <w:t xml:space="preserve"> Sun et al. [8] fed raw HFCT pulses (251 samples each) from electrode models of four cable-terminal defects directly into a small 1D CNN, without extracting any features, and reached 95.8%. Peng et al. [9] also used a 1D CNN on cable PD pulses, but its input was a vector of features already extracted from each pulse. This shows that using a CNN does not always mean learning from the raw signal. Nguyen et al. [10] applied a two-layer LSTM to sequences of 60 consecutive PRPD cycles from gas-insulated switchgear (GIS) and reached 96.74%, which was higher than the ANN and SVM baselines, although the LSTM took longer to train and test. An LSTM is useful when the order of the measurements carries information, as it does in continuous monitoring.</w:t>
+        <w:t xml:space="preserve"> Here the model works on the time-domain pulse recorded by the sensor. A small 1D CNN trained directly on raw HFCT pulses (251 samples each) from four cable-terminal defect models reached 95.8%, without any feature extraction [8]. A 1D CNN can also be given a vector of features taken from each pulse instead of the raw signal, which reached 92.57% for five defects in EPR cable [9]. This shows that using a CNN does not always mean learning from the raw signal. The main advantage of this family is that each pulse can be classified on its own, without a phase reference.</w:t>
       </w:r>
     </w:p>
     <w:p>
@@ -507,10 +507,25 @@
           <w:b/>
           <w:bCs/>
         </w:rPr>
-        <w:t xml:space="preserve">Images.</w:t>
-      </w:r>
-      <w:r>
-        <w:t xml:space="preserve"> Üçkol et al. [11] converted PRPD patterns from five workmanship defects in 36 kV XLPE cable terminations into 64 × 64 colour images and trained a 2D CNN on them. Their own CNN reached 96.77% overall and was both more accurate and much faster than pretrained networks such as AlexNet and VGG-16. Li et al. [12] used a Swin Transformer, a newer attention-based image model, on 1,426 PRPD maps from a cable test platform and reached 97.52%, with less computation than VGG16. Images can also be made from single pulses. Xie et al. [13] turned denoised pulses into S-transform (time–frequency) images and used a 2D CNN to separate PD from corona interference, with an accuracy of up to 98.75%.</w:t>
+        <w:t xml:space="preserve">PRPD (2D) patterns.</w:t>
+      </w:r>
+      <w:r>
+        <w:t xml:space="preserve"> Here the model works on the phase-resolved data itself instead of on hand-crafted statistics. An LSTM was applied to sequences of 60 consecutive PRPD cycles from gas-insulated switchgear (GIS), so it could also use how the pattern changes from one cycle to the next [10]. It reached 96.74%, higher than the ANN and SVM baselines, but it took longer to train and test. A Swin Transformer, a newer attention-based model, was applied to 1,426 PRPD maps from a cable test platform and reached 97.52% with less computation than VGG16 [11]. This family needs a voltage phase reference and enough cycles to build each pattern.</w:t>
+      </w:r>
+    </w:p>
+    <w:p>
+      <w:pPr>
+        <w:keepNext w:val="false"/>
+      </w:pPr>
+      <w:r>
+        <w:rPr>
+          <w:b/>
+          <w:bCs/>
+        </w:rPr>
+        <w:t xml:space="preserve">Image-based.</w:t>
+      </w:r>
+      <w:r>
+        <w:t xml:space="preserve"> Here the data is first turned into a picture and then classified with an image model. PRPD patterns from five workmanship defects in 36 kV XLPE cable terminations were saved as 64 × 64 colour images and classified with a 2D CNN, which reached 96.77% and was both more accurate and much faster than pretrained networks such as AlexNet and VGG-16 [12]. Images can also be made from single pulses. S-transform (time–frequency) images of denoised pulses were used with a 2D CNN to separate PD from corona interference, with an accuracy of up to 98.75% [13]. This family can reuse well-known image models, but it adds a conversion step and usually needs more data.</w:t>
       </w:r>
     </w:p>
     <w:p>
@@ -525,7 +540,7 @@
         <w:t xml:space="preserve">Limitations.</w:t>
       </w:r>
       <w:r>
-        <w:t xml:space="preserve"> DL removes the need to design features by hand, but it usually needs more labelled data and more computing power, and its decisions are harder to explain [3]. The network structure and training settings still have to be tuned for each application [3], [11], and the gain over traditional methods is sometimes small (Section 2.5.4).</w:t>
+        <w:t xml:space="preserve"> DL removes the need to design features by hand, but it usually needs more labelled data and more computing power, and its decisions are harder to explain [3]. The network structure and training settings still have to be tuned for each application [3], [12], and the gain over traditional methods is sometimes small (Section 2.5.4).</w:t>
       </w:r>
     </w:p>
     <w:p>
@@ -1590,7 +1605,7 @@
               <w:jc w:val="left"/>
             </w:pPr>
             <w:r>
-              <w:t xml:space="preserve">Temporal: sequence of 60 PRPD cycles</w:t>
+              <w:t xml:space="preserve">PRPD: sequence of 60 PRPD cycles</w:t>
             </w:r>
           </w:p>
         </w:tc>
@@ -1961,7 +1976,7 @@
                 <w:b/>
                 <w:bCs/>
               </w:rPr>
-              <w:t xml:space="preserve">Üçkol et al. [11], 2021</w:t>
+              <w:t xml:space="preserve">Üçkol et al. [12], 2021</w:t>
             </w:r>
           </w:p>
         </w:tc>
@@ -2169,7 +2184,7 @@
                 <w:b/>
                 <w:bCs/>
               </w:rPr>
-              <w:t xml:space="preserve">Li et al. [12], 2025</w:t>
+              <w:t xml:space="preserve">Li et al. [11], 2025</w:t>
             </w:r>
           </w:p>
         </w:tc>
@@ -2223,7 +2238,7 @@
               <w:jc w:val="left"/>
             </w:pPr>
             <w:r>
-              <w:t xml:space="preserve">Image: PRPD map</w:t>
+              <w:t xml:space="preserve">PRPD: PRPD map</w:t>
             </w:r>
           </w:p>
         </w:tc>
@@ -2712,7 +2727,7 @@
               <w:jc w:val="left"/>
             </w:pPr>
             <w:r>
-              <w:t xml:space="preserve">92.57–97.29% [7], [8], [9]; LSTM 96.74% [10]</w:t>
+              <w:t xml:space="preserve">92.57–97.29% [7], [8], [9]</w:t>
             </w:r>
           </w:p>
         </w:tc>
@@ -2739,7 +2754,7 @@
               <w:jc w:val="left"/>
             </w:pPr>
             <w:r>
-              <w:t xml:space="preserve">Up to 98.8% on clean data [6]</w:t>
+              <w:t xml:space="preserve">Up to 98.8% with SVM on clean data [6]; 96.74% (LSTM) [10]; 97.52% (Swin) [11]</w:t>
             </w:r>
           </w:p>
         </w:tc>
@@ -2766,7 +2781,7 @@
               <w:jc w:val="left"/>
             </w:pPr>
             <w:r>
-              <w:t xml:space="preserve">96.77–97.52% for defect types [11], [12]; 98.75% for PD vs interference [13]</w:t>
+              <w:t xml:space="preserve">96.77% for defect types [12]; 98.75% for PD vs interference [13]</w:t>
             </w:r>
           </w:p>
         </w:tc>
@@ -2831,7 +2846,7 @@
               <w:jc w:val="left"/>
             </w:pPr>
             <w:r>
-              <w:t xml:space="preserve">Low for an SVM or a small 1D CNN; LSTM slower [10]</w:t>
+              <w:t xml:space="preserve">Low for an SVM or a small 1D CNN</w:t>
             </w:r>
           </w:p>
         </w:tc>
@@ -2858,7 +2873,7 @@
               <w:jc w:val="left"/>
             </w:pPr>
             <w:r>
-              <w:t xml:space="preserve">Low; SVM fastest to train [6]</w:t>
+              <w:t xml:space="preserve">Low for SVM, the fastest to train [6]; LSTM slower [10]</w:t>
             </w:r>
           </w:p>
         </w:tc>
@@ -2885,7 +2900,7 @@
               <w:jc w:val="left"/>
             </w:pPr>
             <w:r>
-              <w:t xml:space="preserve">Highest for pretrained models: VGG-16 took 9,349 s against 485 s for a small CNN [11]</w:t>
+              <w:t xml:space="preserve">Highest for pretrained models: VGG-16 took 9,349 s against 485 s for a small CNN [12]</w:t>
             </w:r>
           </w:p>
         </w:tc>
@@ -2977,7 +2992,7 @@
               <w:jc w:val="left"/>
             </w:pPr>
             <w:r>
-              <w:t xml:space="preserve">Feature extraction, which needs expert choices [3]</w:t>
+              <w:t xml:space="preserve">Feature extraction for ML, which needs expert choices [3]; little for DL</w:t>
             </w:r>
           </w:p>
         </w:tc>
@@ -3096,7 +3111,7 @@
               <w:jc w:val="left"/>
             </w:pPr>
             <w:r>
-              <w:t xml:space="preserve">Large drop: SVM fell to 48.2–75.6% with 60 s of noise [6]</w:t>
+              <w:t xml:space="preserve">Large drop: SVM fell to 48.2–75.6% with 60 s of noise [6]; not tested for the Swin model [11]</w:t>
             </w:r>
           </w:p>
         </w:tc>
@@ -3123,7 +3138,7 @@
               <w:jc w:val="left"/>
             </w:pPr>
             <w:r>
-              <w:t xml:space="preserve">Little evidence; left as future work [11], [12]</w:t>
+              <w:t xml:space="preserve">Little evidence; left as future work [12]</w:t>
             </w:r>
           </w:p>
         </w:tc>
@@ -3539,7 +3554,7 @@
         </w:numPr>
       </w:pPr>
       <w:r>
-        <w:t xml:space="preserve">an LSTM on sequences of PD cycles, which can use the order of the measurements; and</w:t>
+        <w:t xml:space="preserve">an LSTM on sequences of PRPD cycles, which can use the order of the measurements; and</w:t>
       </w:r>
     </w:p>
     <w:p>
@@ -3590,7 +3605,7 @@
         <w:t xml:space="preserve">Metrics.</w:t>
       </w:r>
       <w:r>
-        <w:t xml:space="preserve"> Overall accuracy can hide weak classes. Nguyen et al. [10] reported 96.74% overall but only 79.54% for floating discharge, and Peng et al. [9] reported 92.57% overall but only 80.87% and 85.42% for two similar protrusion defects. The project will therefore report accuracy together with the confusion matrix and the per-class precision, recall and F1-score, as reported by Sun et al. [8]. This matters most for the noise class, where mistakes lead either to false alarms or to missed PD.</w:t>
+        <w:t xml:space="preserve"> Overall accuracy can hide weak classes. In one study the overall accuracy was 96.74% but only 79.54% for floating discharge [10], and in another it was 92.57% overall but only 80.87% and 85.42% for two similar protrusion defects [9]. The project will therefore report accuracy together with the confusion matrix and the per-class precision, recall and F1-score, as done in [8]. This matters most for the noise class, where mistakes lead either to false alarms or to missed PD.</w:t>
       </w:r>
     </w:p>
     <w:p>
@@ -3605,7 +3620,7 @@
         <w:t xml:space="preserve">Noise.</w:t>
       </w:r>
       <w:r>
-        <w:t xml:space="preserve"> Raymond et al. [6] trained classifiers on clean data and then tested them with real noise added for 5 to 60 s. Accuracy fell for every classifier and feature set. For an SVM with statistical features it fell from 98.8% without noise to 48.2% with 60 s of noise, and even the most noise-tolerant option, an SVM with PCA features, fell to 75.6%. Most DL studies reviewed used clean data, and [11] and [12] list noise robustness as future work. The models in this project will therefore also be tested on data that contains real laboratory noise.</w:t>
+        <w:t xml:space="preserve"> In one study, classifiers were trained on clean data and then tested with real noise added for 5 to 60 s [6]. Accuracy fell for every classifier and feature set. For an SVM with statistical features it fell from 98.8% without noise to 48.2% with 60 s of noise, and even the most noise-tolerant option, an SVM with PCA features, fell to 75.6%. Most DL studies reviewed used clean data, and [12] and [11] list noise robustness as future work. The models in this project will therefore also be tested on data that contains real laboratory noise.</w:t>
       </w:r>
     </w:p>
     <w:p>
@@ -3620,7 +3635,7 @@
         <w:t xml:space="preserve">New specimens and data splitting.</w:t>
       </w:r>
       <w:r>
-        <w:t xml:space="preserve"> Üçkol et al. [11] obtained 98.8% when data from both cable sets were mixed, but 97.2% and 94.3% when the model was trained on one set and tested on the other. Random splits of individual pulses [8] or of overlapping windows [10] can put data from the same recording into both the training and test sets, which makes the results look better than they really are. In this project, the data will be split by specimen or by measurement session.</w:t>
+        <w:t xml:space="preserve"> In [12], accuracy was 98.8% when data from both cable sets were mixed, but 97.2% and 94.3% when the model was trained on one set and tested on the other. Random splits of individual pulses [8] or of overlapping windows [10] can put data from the same recording into both the training and test sets, which makes the results look better than they really are. In this project, the data will be split by specimen or by measurement session.</w:t>
       </w:r>
     </w:p>
     <w:p>
@@ -3650,7 +3665,7 @@
         <w:t xml:space="preserve">Link to early warning.</w:t>
       </w:r>
       <w:r>
-        <w:t xml:space="preserve"> PD patterns change as the insulation ages [2], so classification could later support condition monitoring. Some studies have gone further. Sahoo and Karmakar [14] classified the growth stage of electrical trees in XLPE from PRPD images, and Wang et al. [15] used an LSTM to forecast a PD-based failure indicator for winding insulation that was aged until it failed. Both studies needed run-to-failure data from accelerated-ageing tests. Since such data are not available to the team yet, this project focuses on classifying the PD type, and early warning is kept as a possible future extension.</w:t>
+        <w:t xml:space="preserve"> PD patterns change as the insulation ages [2], so classification could later support condition monitoring. Some studies have gone further. One classified the growth stage of electrical trees in XLPE from PRPD images [14], and another used an LSTM to forecast a PD-based failure indicator for winding insulation that was aged until it failed [15]. Both studies needed run-to-failure data from accelerated-ageing tests. Since such data are not available to the team yet, this project focuses on classifying the PD type, and early warning is kept as a possible future extension.</w:t>
       </w:r>
     </w:p>
     <w:p>
@@ -3912,6 +3927,30 @@
         <w:t xml:space="preserve">	</w:t>
       </w:r>
       <w:r>
+        <w:t xml:space="preserve">Y. Li et al., "Partial discharge pattern recognition based on Swin Transformer for power cable fault diagnosis in modern distribution systems," </w:t>
+      </w:r>
+      <w:r>
+        <w:rPr>
+          <w:i/>
+          <w:iCs/>
+        </w:rPr>
+        <w:t xml:space="preserve">Processes</w:t>
+      </w:r>
+      <w:r>
+        <w:t xml:space="preserve">, vol. 13, no. 3, 852, 2025. https://doi.org/10.3390/pr13030852</w:t>
+      </w:r>
+    </w:p>
+    <w:p>
+      <w:pPr>
+        <w:pStyle w:val="Reference"/>
+      </w:pPr>
+      <w:r>
+        <w:t xml:space="preserve">[12]</w:t>
+      </w:r>
+      <w:r>
+        <w:t xml:space="preserve">	</w:t>
+      </w:r>
+      <w:r>
         <w:t xml:space="preserve">H. İ. Üçkol, S. İlhan, and A. Özdemir, "Workmanship defect classification in medium voltage cable terminations with convolutional neural network," </w:t>
       </w:r>
       <w:r>
@@ -3923,30 +3962,6 @@
       </w:r>
       <w:r>
         <w:t xml:space="preserve">, vol. 194, 107105, 2021. https://doi.org/10.1016/j.epsr.2021.107105</w:t>
-      </w:r>
-    </w:p>
-    <w:p>
-      <w:pPr>
-        <w:pStyle w:val="Reference"/>
-      </w:pPr>
-      <w:r>
-        <w:t xml:space="preserve">[12]</w:t>
-      </w:r>
-      <w:r>
-        <w:t xml:space="preserve">	</w:t>
-      </w:r>
-      <w:r>
-        <w:t xml:space="preserve">Y. Li et al., "Partial discharge pattern recognition based on Swin Transformer for power cable fault diagnosis in modern distribution systems," </w:t>
-      </w:r>
-      <w:r>
-        <w:rPr>
-          <w:i/>
-          <w:iCs/>
-        </w:rPr>
-        <w:t xml:space="preserve">Processes</w:t>
-      </w:r>
-      <w:r>
-        <w:t xml:space="preserve">, vol. 13, no. 3, 852, 2025. https://doi.org/10.3390/pr13030852</w:t>
       </w:r>
     </w:p>
     <w:p>

</xml_diff>

<commit_message>
Section 2.5: spell out random forest instead of RF and name the baseline features
Co-Authored-By: Claude Opus 5.5 <noreply@anthropic.com>
Claude-Session: https://claude.ai/code/session_014SkMbo2NZiwC1uVAmAQ9cR
</commit_message>
<xml_diff>
--- a/literature-review/Section_2.5_Revised.docx
+++ b/literature-review/Section_2.5_Revised.docx
@@ -349,7 +349,7 @@
         <w:t xml:space="preserve">Features.</w:t>
       </w:r>
       <w:r>
-        <w:t xml:space="preserve"> For PRPD data, the most common features are statistical operators that describe the shape of the phase-resolved distributions, such as skewness, kurtosis, the number of peaks and the cross-correlation between the positive and negative half-cycles [5]. Fractal features [1] and principal component analysis (PCA) [6] have also been used. For time-resolved data, the features describe each pulse, for example its amplitude, its rise and decay times, and statistical or frequency-domain values [3]. Because so many features can be extracted, some studies keep only the most useful ones. For example, a random forest (RF) has been used to select the best features from more than 1,200 pulse and PRPD features [4].</w:t>
+        <w:t xml:space="preserve"> For PRPD data, the most common features are statistical operators that describe the shape of the phase-resolved distributions, such as skewness, kurtosis, the number of peaks and the cross-correlation between the positive and negative half-cycles [5]. Fractal features [1] and principal component analysis (PCA) [6] have also been used. For time-resolved data, the features describe each pulse, for example its amplitude, its rise and decay times, and statistical or frequency-domain values [3]. Because so many features can be extracted, some studies keep only the most useful ones. For example, a random forest classifier has been used to select the best features from more than 1,200 pulse and PRPD features [4].</w:t>
       </w:r>
     </w:p>
     <w:p>
@@ -364,7 +364,7 @@
         <w:t xml:space="preserve">Classifiers.</w:t>
       </w:r>
       <w:r>
-        <w:t xml:space="preserve"> ANNs, mostly back-propagation neural networks (BPNNs), were among the first classifiers used. In early work, statistical descriptors were used as inputs to three types of neural network (back-propagation, Kohonen self-organising map and learning vector quantisation), and all three recognised the trained defects fairly well [5]. ANNs are fast once trained, but they need a lot of representative training data and can overtrain [3]. SVMs separate two classes using the boundary with the largest margin between them, and kernel functions allow this boundary to be non-linear [3]. They do not need a network structure to be designed and have performed well in many PD studies [3]. Other classifiers that have been used include nearest-neighbour, fuzzy logic, adaptive neuro-fuzzy inference systems (ANFIS), decision trees and RF [1], [2], [3].</w:t>
+        <w:t xml:space="preserve"> ANNs, mostly back-propagation neural networks (BPNNs), were among the first classifiers used. In early work, statistical descriptors were used as inputs to three types of neural network (back-propagation, Kohonen self-organising map and learning vector quantisation), and all three recognised the trained defects fairly well [5]. ANNs are fast once trained, but they need a lot of representative training data and can overtrain [3]. SVMs separate two classes using the boundary with the largest margin between them, and kernel functions allow this boundary to be non-linear [3]. They do not need a network structure to be designed and have performed well in many PD studies [3]. Other classifiers that have been used include nearest-neighbour, fuzzy logic, adaptive neuro-fuzzy inference systems (ANFIS), decision trees and random forests [1], [2], [3].</w:t>
       </w:r>
     </w:p>
     <w:p>
@@ -387,7 +387,7 @@
         </w:r>
       </w:fldSimple>
       <w:r>
-        <w:t xml:space="preserve">). An SVM on statistical PRPD features reached 98.8% for defects in XLPE cable joints [6]. For composite defects in XLPE cable, a tuned SVM reached 97.29%, while a standard SVM with the same features gave only 84.52% [7], which shows how much parameter tuning matters. The main advantages of these methods are that the features can be linked to the physics of the discharge, that less data is needed and that training is fast. Their main weakness is that the results depend heavily on the choice of features and parameters, which often needs expert knowledge [3]. Features that work well on clean data may also fail when noise is present (Section 2.5.5). In this project, an SVM and an RF on hand-crafted features will be used as baselines for the DL models.</w:t>
+        <w:t xml:space="preserve">). An SVM on statistical PRPD features reached 98.8% for defects in XLPE cable joints [6]. For composite defects in XLPE cable, a tuned SVM reached 97.29%, while a standard SVM with the same features gave only 84.52% [7], which shows how much parameter tuning matters. The main advantages of these methods are that the features can be linked to the physics of the discharge, that less data is needed and that training is fast. Their main weakness is that the results depend heavily on the choice of features and parameters, which often needs expert knowledge [3]. Features that work well on clean data may also fail when noise is present (Section 2.5.5). In this project, an SVM and a random forest (a classifier made of many decision trees) will be used as baselines for the DL models. Both will use hand-crafted features calculated from the measured HFCT data, such as pulse amplitude, rise time and the statistical features of the PRPD pattern.</w:t>
       </w:r>
     </w:p>
     <w:p>
@@ -3530,7 +3530,7 @@
         </w:numPr>
       </w:pPr>
       <w:r>
-        <w:t xml:space="preserve">an SVM and an RF on hand-crafted features, as baselines;</w:t>
+        <w:t xml:space="preserve">an SVM and a random forest classifier, used as baselines, both trained on hand-crafted features calculated from the HFCT measurements (for example pulse amplitude and rise time, or PRPD statistics such as skewness and kurtosis);</w:t>
       </w:r>
     </w:p>
     <w:p>

</xml_diff>